<commit_message>
Rework working-session doc as Session 3: recap of what's locked (sessions 1-2 + email) + only the genuine gaps
</commit_message>
<xml_diff>
--- a/outputs/schoeman-clinic/Schoeman-Clinic-Working-Session.docx
+++ b/outputs/schoeman-clinic/Schoeman-Clinic-Working-Session.docx
@@ -27,7 +27,7 @@
           <w:color w:val="142A28"/>
           <w:sz w:val="40"/>
         </w:rPr>
-        <w:t>Knowledge Base and Digital Presence</w:t>
+        <w:t>Knowledge Base, Session 3</w:t>
       </w:r>
     </w:p>
     <w:p>
@@ -39,9 +39,9 @@
           <w:b w:val="0"/>
           <w:i/>
           <w:color w:val="55605F"/>
-          <w:sz w:val="27"/>
+          <w:sz w:val="25"/>
         </w:rPr>
-        <w:t>Working Session</w:t>
+        <w:t>Closing the final gaps, and reviewing your digital presence</w:t>
       </w:r>
     </w:p>
     <w:tbl>
@@ -109,14 +109,14 @@
                 <w:color w:val="FFFFFF"/>
                 <w:sz w:val="20"/>
               </w:rPr>
-              <w:t xml:space="preserve">Purpose:  </w:t>
+              <w:t xml:space="preserve">Aim:  </w:t>
             </w:r>
             <w:r>
               <w:rPr>
                 <w:color w:val="FFFFFF"/>
                 <w:sz w:val="20"/>
               </w:rPr>
-              <w:t>Finalise the knowledge base that powers your patient communications, agree the clinical safety and escalation rules, and review your digital presence and next steps.</w:t>
+              <w:t>Confirm what we have already captured, close the last few knowledge base gaps, finalise the clinical safety and escalation detail, and review your digital presence.</w:t>
             </w:r>
           </w:p>
         </w:tc>
@@ -140,234 +140,322 @@
           <w:color w:val="142A28"/>
           <w:sz w:val="28"/>
         </w:rPr>
-        <w:t>Agenda</w:t>
+        <w:t>Confirmed so far (from our first two sessions and your notes)</w:t>
       </w:r>
     </w:p>
-    <w:tbl>
-      <w:tblPr>
-        <w:tblStyle w:val="TableGrid"/>
-        <w:tblW w:type="auto" w:w="0"/>
-        <w:tblLook w:firstColumn="1" w:firstRow="1" w:lastColumn="0" w:lastRow="0" w:noHBand="0" w:noVBand="1" w:val="04A0"/>
-      </w:tblPr>
-      <w:tblGrid>
-        <w:gridCol w:w="4896"/>
-        <w:gridCol w:w="4896"/>
-      </w:tblGrid>
-      <w:tr>
-        <w:tc>
-          <w:tcPr>
-            <w:tcW w:type="dxa" w:w="1584"/>
-            <w:shd w:val="clear" w:fill="142A28"/>
-          </w:tcPr>
-          <w:p>
-            <w:r>
-              <w:rPr>
-                <w:b/>
-                <w:color w:val="FFFFFF"/>
-                <w:sz w:val="19"/>
-              </w:rPr>
-              <w:t>Time</w:t>
-            </w:r>
-          </w:p>
-        </w:tc>
-        <w:tc>
-          <w:tcPr>
-            <w:tcW w:type="dxa" w:w="7776"/>
-            <w:shd w:val="clear" w:fill="142A28"/>
-          </w:tcPr>
-          <w:p>
-            <w:r>
-              <w:rPr>
-                <w:b/>
-                <w:color w:val="FFFFFF"/>
-                <w:sz w:val="19"/>
-              </w:rPr>
-              <w:t>Section</w:t>
-            </w:r>
-          </w:p>
-        </w:tc>
-      </w:tr>
-      <w:tr>
-        <w:tc>
-          <w:tcPr>
-            <w:tcW w:type="dxa" w:w="1584"/>
-          </w:tcPr>
-          <w:p>
-            <w:pPr>
-              <w:spacing w:after="20"/>
-            </w:pPr>
-            <w:r>
-              <w:rPr>
-                <w:b/>
-                <w:color w:val="0E6E68"/>
-                <w:sz w:val="19"/>
-              </w:rPr>
-              <w:t>10 min</w:t>
-            </w:r>
-          </w:p>
-        </w:tc>
-        <w:tc>
-          <w:tcPr>
-            <w:tcW w:type="dxa" w:w="7776"/>
-          </w:tcPr>
-          <w:p>
-            <w:pPr>
-              <w:spacing w:after="20"/>
-            </w:pPr>
-            <w:r>
-              <w:rPr>
-                <w:sz w:val="19"/>
-              </w:rPr>
-              <w:t>1. Finalising the knowledge base</w:t>
-            </w:r>
-          </w:p>
-        </w:tc>
-      </w:tr>
-      <w:tr>
-        <w:tc>
-          <w:tcPr>
-            <w:tcW w:type="dxa" w:w="1584"/>
-          </w:tcPr>
-          <w:p>
-            <w:pPr>
-              <w:spacing w:after="20"/>
-            </w:pPr>
-            <w:r>
-              <w:rPr>
-                <w:b/>
-                <w:color w:val="0E6E68"/>
-                <w:sz w:val="19"/>
-              </w:rPr>
-              <w:t>15 min</w:t>
-            </w:r>
-          </w:p>
-        </w:tc>
-        <w:tc>
-          <w:tcPr>
-            <w:tcW w:type="dxa" w:w="7776"/>
-          </w:tcPr>
-          <w:p>
-            <w:pPr>
-              <w:spacing w:after="20"/>
-            </w:pPr>
-            <w:r>
-              <w:rPr>
-                <w:sz w:val="19"/>
-              </w:rPr>
-              <w:t>2. Clinical safety and escalation</w:t>
-            </w:r>
-          </w:p>
-        </w:tc>
-      </w:tr>
-      <w:tr>
-        <w:tc>
-          <w:tcPr>
-            <w:tcW w:type="dxa" w:w="1584"/>
-          </w:tcPr>
-          <w:p>
-            <w:pPr>
-              <w:spacing w:after="20"/>
-            </w:pPr>
-            <w:r>
-              <w:rPr>
-                <w:b/>
-                <w:color w:val="0E6E68"/>
-                <w:sz w:val="19"/>
-              </w:rPr>
-              <w:t>7 min</w:t>
-            </w:r>
-          </w:p>
-        </w:tc>
-        <w:tc>
-          <w:tcPr>
-            <w:tcW w:type="dxa" w:w="7776"/>
-          </w:tcPr>
-          <w:p>
-            <w:pPr>
-              <w:spacing w:after="20"/>
-            </w:pPr>
-            <w:r>
-              <w:rPr>
-                <w:sz w:val="19"/>
-              </w:rPr>
-              <w:t>3. Doctor routing and oversight</w:t>
-            </w:r>
-          </w:p>
-        </w:tc>
-      </w:tr>
-      <w:tr>
-        <w:tc>
-          <w:tcPr>
-            <w:tcW w:type="dxa" w:w="1584"/>
-          </w:tcPr>
-          <w:p>
-            <w:pPr>
-              <w:spacing w:after="20"/>
-            </w:pPr>
-            <w:r>
-              <w:rPr>
-                <w:b/>
-                <w:color w:val="0E6E68"/>
-                <w:sz w:val="19"/>
-              </w:rPr>
-              <w:t>8 min</w:t>
-            </w:r>
-          </w:p>
-        </w:tc>
-        <w:tc>
-          <w:tcPr>
-            <w:tcW w:type="dxa" w:w="7776"/>
-          </w:tcPr>
-          <w:p>
-            <w:pPr>
-              <w:spacing w:after="20"/>
-            </w:pPr>
-            <w:r>
-              <w:rPr>
-                <w:sz w:val="19"/>
-              </w:rPr>
-              <w:t>4. Digital presence and social</w:t>
-            </w:r>
-          </w:p>
-        </w:tc>
-      </w:tr>
-      <w:tr>
-        <w:tc>
-          <w:tcPr>
-            <w:tcW w:type="dxa" w:w="1584"/>
-          </w:tcPr>
-          <w:p>
-            <w:pPr>
-              <w:spacing w:after="20"/>
-            </w:pPr>
-            <w:r>
-              <w:rPr>
-                <w:b/>
-                <w:color w:val="0E6E68"/>
-                <w:sz w:val="19"/>
-              </w:rPr>
-              <w:t>5 min</w:t>
-            </w:r>
-          </w:p>
-        </w:tc>
-        <w:tc>
-          <w:tcPr>
-            <w:tcW w:type="dxa" w:w="7776"/>
-          </w:tcPr>
-          <w:p>
-            <w:pPr>
-              <w:spacing w:after="20"/>
-            </w:pPr>
-            <w:r>
-              <w:rPr>
-                <w:sz w:val="19"/>
-              </w:rPr>
-              <w:t>5. Access and next steps</w:t>
-            </w:r>
-          </w:p>
-        </w:tc>
-      </w:tr>
-    </w:tbl>
+    <w:p>
+      <w:pPr>
+        <w:spacing w:after="60" w:before="0"/>
+      </w:pPr>
+      <w:r>
+        <w:rPr>
+          <w:b w:val="0"/>
+          <w:i/>
+          <w:color w:val="55605F"/>
+          <w:sz w:val="21"/>
+        </w:rPr>
+        <w:t>A quick scan so we are aligned. Please flag anything that has changed, otherwise it is locked and we move on.</w:t>
+      </w:r>
+    </w:p>
+    <w:p>
+      <w:pPr>
+        <w:spacing w:before="160" w:after="40"/>
+      </w:pPr>
+      <w:r>
+        <w:rPr>
+          <w:b/>
+          <w:color w:val="0B534E"/>
+          <w:sz w:val="22"/>
+        </w:rPr>
+        <w:t>Consultations, bookings and bloods</w:t>
+      </w:r>
+    </w:p>
+    <w:p>
+      <w:pPr>
+        <w:pStyle w:val="ListBullet"/>
+        <w:spacing w:after="40"/>
+      </w:pPr>
+      <w:r>
+        <w:rPr>
+          <w:b/>
+          <w:sz w:val="19"/>
+        </w:rPr>
+        <w:t xml:space="preserve">Consultations: </w:t>
+      </w:r>
+      <w:r>
+        <w:rPr>
+          <w:sz w:val="19"/>
+        </w:rPr>
+        <w:t>concise £350, standard £500, comprehensive £750; follow-ups 30 min £250 (standard and functional/gut); 15 min brief for outstanding bloods.</w:t>
+      </w:r>
+    </w:p>
+    <w:p>
+      <w:pPr>
+        <w:pStyle w:val="ListBullet"/>
+        <w:spacing w:after="40"/>
+      </w:pPr>
+      <w:r>
+        <w:rPr>
+          <w:b/>
+          <w:sz w:val="19"/>
+        </w:rPr>
+        <w:t xml:space="preserve">Bloods: </w:t>
+      </w:r>
+      <w:r>
+        <w:rPr>
+          <w:sz w:val="19"/>
+        </w:rPr>
+        <w:t>mandatory before the first consultation, via TDL (Wimpole Street) or home kit or own results; menstruating patients test days 18 to 22; consultation about one month after the test.</w:t>
+      </w:r>
+    </w:p>
+    <w:p>
+      <w:pPr>
+        <w:pStyle w:val="ListBullet"/>
+        <w:spacing w:after="40"/>
+      </w:pPr>
+      <w:r>
+        <w:rPr>
+          <w:b/>
+          <w:sz w:val="19"/>
+        </w:rPr>
+        <w:t xml:space="preserve">Discovery calls: </w:t>
+      </w:r>
+      <w:r>
+        <w:rPr>
+          <w:sz w:val="19"/>
+        </w:rPr>
+        <w:t>free 10 to 15 minutes, run by the PAs; anyone unsure is guided to a discovery call.</w:t>
+      </w:r>
+    </w:p>
+    <w:p>
+      <w:pPr>
+        <w:pStyle w:val="ListBullet"/>
+        <w:spacing w:after="40"/>
+      </w:pPr>
+      <w:r>
+        <w:rPr>
+          <w:b/>
+          <w:sz w:val="19"/>
+        </w:rPr>
+        <w:t xml:space="preserve">Access rules: </w:t>
+      </w:r>
+      <w:r>
+        <w:rPr>
+          <w:sz w:val="19"/>
+        </w:rPr>
+        <w:t>international patients welcome with a UK address; no referral required; 18 and over only.</w:t>
+      </w:r>
+    </w:p>
+    <w:p>
+      <w:pPr>
+        <w:spacing w:before="160" w:after="40"/>
+      </w:pPr>
+      <w:r>
+        <w:rPr>
+          <w:b/>
+          <w:color w:val="0B534E"/>
+          <w:sz w:val="22"/>
+        </w:rPr>
+        <w:t>Appointments, recall and letters</w:t>
+      </w:r>
+    </w:p>
+    <w:p>
+      <w:pPr>
+        <w:pStyle w:val="ListBullet"/>
+        <w:spacing w:after="40"/>
+      </w:pPr>
+      <w:r>
+        <w:rPr>
+          <w:b/>
+          <w:sz w:val="19"/>
+        </w:rPr>
+        <w:t xml:space="preserve">Cancellations: </w:t>
+      </w:r>
+      <w:r>
+        <w:rPr>
+          <w:sz w:val="19"/>
+        </w:rPr>
+        <w:t>48 hours notice or the full fee applies; standard reschedule wording agreed.</w:t>
+      </w:r>
+    </w:p>
+    <w:p>
+      <w:pPr>
+        <w:pStyle w:val="ListBullet"/>
+        <w:spacing w:after="40"/>
+      </w:pPr>
+      <w:r>
+        <w:rPr>
+          <w:b/>
+          <w:sz w:val="19"/>
+        </w:rPr>
+        <w:t xml:space="preserve">Recall: </w:t>
+      </w:r>
+      <w:r>
+        <w:rPr>
+          <w:sz w:val="19"/>
+        </w:rPr>
+        <w:t>reminder for a planned follow-up sent 6 weeks ahead; plus a re-engagement flow for overdue patients, and those patients also given to the admin team as a list and an email.</w:t>
+      </w:r>
+    </w:p>
+    <w:p>
+      <w:pPr>
+        <w:pStyle w:val="ListBullet"/>
+        <w:spacing w:after="40"/>
+      </w:pPr>
+      <w:r>
+        <w:rPr>
+          <w:b/>
+          <w:sz w:val="19"/>
+        </w:rPr>
+        <w:t xml:space="preserve">Post-consultation letter: </w:t>
+      </w:r>
+      <w:r>
+        <w:rPr>
+          <w:sz w:val="19"/>
+        </w:rPr>
+        <w:t>ready within 5 working days; agreed holding responses for before and after that window.</w:t>
+      </w:r>
+    </w:p>
+    <w:p>
+      <w:pPr>
+        <w:spacing w:before="160" w:after="40"/>
+      </w:pPr>
+      <w:r>
+        <w:rPr>
+          <w:b/>
+          <w:color w:val="0B534E"/>
+          <w:sz w:val="22"/>
+        </w:rPr>
+        <w:t>Clinical safety, so far</w:t>
+      </w:r>
+    </w:p>
+    <w:p>
+      <w:pPr>
+        <w:pStyle w:val="ListBullet"/>
+        <w:spacing w:after="40"/>
+      </w:pPr>
+      <w:r>
+        <w:rPr>
+          <w:b/>
+          <w:sz w:val="19"/>
+        </w:rPr>
+        <w:t xml:space="preserve">Results: </w:t>
+      </w:r>
+      <w:r>
+        <w:rPr>
+          <w:sz w:val="19"/>
+        </w:rPr>
+        <w:t>always go to the clinician, never sent to the patient, unless the patient supplies their own.</w:t>
+      </w:r>
+    </w:p>
+    <w:p>
+      <w:pPr>
+        <w:pStyle w:val="ListBullet"/>
+        <w:spacing w:after="40"/>
+      </w:pPr>
+      <w:r>
+        <w:rPr>
+          <w:b/>
+          <w:sz w:val="19"/>
+        </w:rPr>
+        <w:t xml:space="preserve">Emails: </w:t>
+      </w:r>
+      <w:r>
+        <w:rPr>
+          <w:sz w:val="19"/>
+        </w:rPr>
+        <w:t>two short emails, then it becomes a paid consultation (15 or 30 minutes).</w:t>
+      </w:r>
+    </w:p>
+    <w:p>
+      <w:pPr>
+        <w:pStyle w:val="ListBullet"/>
+        <w:spacing w:after="40"/>
+      </w:pPr>
+      <w:r>
+        <w:rPr>
+          <w:b/>
+          <w:sz w:val="19"/>
+        </w:rPr>
+        <w:t xml:space="preserve">Prescriptions: </w:t>
+      </w:r>
+      <w:r>
+        <w:rPr>
+          <w:sz w:val="19"/>
+        </w:rPr>
+        <w:t>only for current patients; the team checks the appointment and treatment plan before a repeat.</w:t>
+      </w:r>
+    </w:p>
+    <w:p>
+      <w:pPr>
+        <w:pStyle w:val="ListBullet"/>
+        <w:spacing w:after="40"/>
+      </w:pPr>
+      <w:r>
+        <w:rPr>
+          <w:b/>
+          <w:sz w:val="19"/>
+        </w:rPr>
+        <w:t xml:space="preserve">Routing: </w:t>
+      </w:r>
+      <w:r>
+        <w:rPr>
+          <w:sz w:val="19"/>
+        </w:rPr>
+        <w:t>all clinical questions reviewed by a clinician; appointment date changes always handled by a PA; sensitive items recorded on Semble by hand for now.</w:t>
+      </w:r>
+    </w:p>
+    <w:p>
+      <w:pPr>
+        <w:spacing w:before="160" w:after="40"/>
+      </w:pPr>
+      <w:r>
+        <w:rPr>
+          <w:b/>
+          <w:color w:val="0B534E"/>
+          <w:sz w:val="22"/>
+        </w:rPr>
+        <w:t>Tone and out of hours</w:t>
+      </w:r>
+    </w:p>
+    <w:p>
+      <w:pPr>
+        <w:pStyle w:val="ListBullet"/>
+        <w:spacing w:after="40"/>
+      </w:pPr>
+      <w:r>
+        <w:rPr>
+          <w:b/>
+          <w:sz w:val="19"/>
+        </w:rPr>
+        <w:t xml:space="preserve">Tone: </w:t>
+      </w:r>
+      <w:r>
+        <w:rPr>
+          <w:sz w:val="19"/>
+        </w:rPr>
+        <w:t>warm, patient centred and polished; no negative wording; no emojis; no comparisons to other clinics; sign off "Best wishes, The Schoeman Clinic Team".</w:t>
+      </w:r>
+    </w:p>
+    <w:p>
+      <w:pPr>
+        <w:pStyle w:val="ListBullet"/>
+        <w:spacing w:after="40"/>
+      </w:pPr>
+      <w:r>
+        <w:rPr>
+          <w:b/>
+          <w:sz w:val="19"/>
+        </w:rPr>
+        <w:t xml:space="preserve">Out of hours: </w:t>
+      </w:r>
+      <w:r>
+        <w:rPr>
+          <w:sz w:val="19"/>
+        </w:rPr>
+        <w:t>agreed WhatsApp holding message in place; escalation line agreed.</w:t>
+      </w:r>
+    </w:p>
     <w:p>
       <w:pPr>
         <w:spacing w:before="260" w:after="60"/>
@@ -381,7 +469,7 @@
           <w:color w:val="142A28"/>
           <w:sz w:val="28"/>
         </w:rPr>
-        <w:t>1. Finalising the knowledge base</w:t>
+        <w:t>1. The final knowledge base gaps</w:t>
       </w:r>
     </w:p>
     <w:p>
@@ -395,7 +483,7 @@
           <w:color w:val="55605F"/>
           <w:sz w:val="21"/>
         </w:rPr>
-        <w:t>A few remaining questions so the team, and later the assistant, always have accurate and approved answers to give patients.</w:t>
+        <w:t>The last operational details we still need from you, so the team and the assistant always have accurate, approved answers.</w:t>
       </w:r>
     </w:p>
     <w:p>
@@ -408,7 +496,7 @@
           <w:color w:val="0B534E"/>
           <w:sz w:val="22"/>
         </w:rPr>
-        <w:t>Services and what you treat</w:t>
+        <w:t>Services and referrals</w:t>
       </w:r>
     </w:p>
     <w:p>
@@ -469,7 +557,7 @@
           <w:color w:val="0B534E"/>
           <w:sz w:val="22"/>
         </w:rPr>
-        <w:t>Consultations and blood tests</w:t>
+        <w:t>Blood tests and payments</w:t>
       </w:r>
     </w:p>
     <w:p>
@@ -505,7 +593,7 @@
         <w:rPr>
           <w:sz w:val="21"/>
         </w:rPr>
-        <w:t>A simple, patient friendly reason for the roughly one month gap between the blood test and the consultation?</w:t>
+        <w:t>Refund or cancellation position if a blood test is paid but the patient does not go ahead?</w:t>
       </w:r>
     </w:p>
     <w:p>
@@ -517,7 +605,7 @@
         <w:rPr>
           <w:sz w:val="21"/>
         </w:rPr>
-        <w:t>Anything a patient should bring or prepare before a consultation, beyond photo ID?</w:t>
+        <w:t>What a legitimate payment link and sender looks like, so the team can reassure a patient who asks if it is genuine?</w:t>
       </w:r>
     </w:p>
     <w:p>
@@ -530,56 +618,7 @@
           <w:color w:val="0B534E"/>
           <w:sz w:val="22"/>
         </w:rPr>
-        <w:t>Payments</w:t>
-      </w:r>
-    </w:p>
-    <w:p>
-      <w:pPr>
-        <w:pStyle w:val="ListBullet"/>
-        <w:spacing w:after="80"/>
-      </w:pPr>
-      <w:r>
-        <w:rPr>
-          <w:sz w:val="21"/>
-        </w:rPr>
-        <w:t>Accepted payment methods, and how quickly the blood test link should be paid?</w:t>
-      </w:r>
-    </w:p>
-    <w:p>
-      <w:pPr>
-        <w:pStyle w:val="ListBullet"/>
-        <w:spacing w:after="80"/>
-      </w:pPr>
-      <w:r>
-        <w:rPr>
-          <w:sz w:val="21"/>
-        </w:rPr>
-        <w:t>Refund or cancellation position if a blood test is paid but the patient does not go ahead with a consultation?</w:t>
-      </w:r>
-    </w:p>
-    <w:p>
-      <w:pPr>
-        <w:pStyle w:val="ListBullet"/>
-        <w:spacing w:after="80"/>
-      </w:pPr>
-      <w:r>
-        <w:rPr>
-          <w:sz w:val="21"/>
-        </w:rPr>
-        <w:t>What a legitimate payment link and sender looks like, so the team can reassure a patient who asks whether it is genuine?</w:t>
-      </w:r>
-    </w:p>
-    <w:p>
-      <w:pPr>
-        <w:spacing w:before="160" w:after="40"/>
-      </w:pPr>
-      <w:r>
-        <w:rPr>
-          <w:b/>
-          <w:color w:val="0B534E"/>
-          <w:sz w:val="22"/>
-        </w:rPr>
-        <w:t>Prescriptions, pharmacies and supplements</w:t>
+        <w:t>Prescriptions and pharmacies</w:t>
       </w:r>
     </w:p>
     <w:p>
@@ -665,10 +704,10 @@
       <w:r>
         <w:rPr>
           <w:b/>
-          <w:color w:val="142A28"/>
+          <w:color w:val="A33A2C"/>
           <w:sz w:val="28"/>
         </w:rPr>
-        <w:t>2. Clinical safety and escalation</w:t>
+        <w:t>2. Finalising the clinical safety detail</w:t>
       </w:r>
     </w:p>
     <w:p>
@@ -681,155 +720,7 @@
           <w:i w:val="0"/>
           <w:sz w:val="21"/>
         </w:rPr>
-        <w:t>So the team, and later the assistant, always know exactly what to handle and what to pass to a clinician. Every incoming message falls into one of three levels:</w:t>
-      </w:r>
-    </w:p>
-    <w:tbl>
-      <w:tblPr>
-        <w:tblStyle w:val="TableGrid"/>
-        <w:tblW w:type="auto" w:w="0"/>
-        <w:tblLook w:firstColumn="1" w:firstRow="1" w:lastColumn="0" w:lastRow="0" w:noHBand="0" w:noVBand="1" w:val="04A0"/>
-      </w:tblPr>
-      <w:tblGrid>
-        <w:gridCol w:w="4896"/>
-        <w:gridCol w:w="4896"/>
-      </w:tblGrid>
-      <w:tr>
-        <w:tc>
-          <w:tcPr>
-            <w:tcW w:type="dxa" w:w="2160"/>
-            <w:shd w:val="clear" w:fill="142A28"/>
-          </w:tcPr>
-          <w:p>
-            <w:r>
-              <w:rPr>
-                <w:b/>
-                <w:color w:val="FFFFFF"/>
-                <w:sz w:val="19"/>
-              </w:rPr>
-              <w:t>Level</w:t>
-            </w:r>
-          </w:p>
-        </w:tc>
-        <w:tc>
-          <w:tcPr>
-            <w:tcW w:type="dxa" w:w="7200"/>
-            <w:shd w:val="clear" w:fill="142A28"/>
-          </w:tcPr>
-          <w:p>
-            <w:r>
-              <w:rPr>
-                <w:b/>
-                <w:color w:val="FFFFFF"/>
-                <w:sz w:val="19"/>
-              </w:rPr>
-              <w:t>What happens</w:t>
-            </w:r>
-          </w:p>
-        </w:tc>
-      </w:tr>
-      <w:tr>
-        <w:tc>
-          <w:tcPr>
-            <w:tcW w:type="dxa" w:w="2160"/>
-          </w:tcPr>
-          <w:p>
-            <w:r>
-              <w:rPr>
-                <w:b/>
-                <w:color w:val="2E6B4F"/>
-                <w:sz w:val="19"/>
-              </w:rPr>
-              <w:t>1  Operational</w:t>
-            </w:r>
-          </w:p>
-        </w:tc>
-        <w:tc>
-          <w:tcPr>
-            <w:tcW w:type="dxa" w:w="7200"/>
-          </w:tcPr>
-          <w:p>
-            <w:r>
-              <w:rPr>
-                <w:sz w:val="19"/>
-              </w:rPr>
-              <w:t>Handled by the team: bookings, rescheduling, blood logistics, pricing, locations, pharmacy status, general admin.</w:t>
-            </w:r>
-          </w:p>
-        </w:tc>
-      </w:tr>
-      <w:tr>
-        <w:tc>
-          <w:tcPr>
-            <w:tcW w:type="dxa" w:w="2160"/>
-          </w:tcPr>
-          <w:p>
-            <w:r>
-              <w:rPr>
-                <w:b/>
-                <w:color w:val="8A5A0C"/>
-                <w:sz w:val="19"/>
-              </w:rPr>
-              <w:t>2  Clinical or sensitive</w:t>
-            </w:r>
-          </w:p>
-        </w:tc>
-        <w:tc>
-          <w:tcPr>
-            <w:tcW w:type="dxa" w:w="7200"/>
-          </w:tcPr>
-          <w:p>
-            <w:r>
-              <w:rPr>
-                <w:sz w:val="19"/>
-              </w:rPr>
-              <w:t>Passed to a clinician, never answered by the team or the assistant: symptoms, results, medication, "is this safe", or anything about a specific patient’s history.</w:t>
-            </w:r>
-          </w:p>
-        </w:tc>
-      </w:tr>
-      <w:tr>
-        <w:tc>
-          <w:tcPr>
-            <w:tcW w:type="dxa" w:w="2160"/>
-          </w:tcPr>
-          <w:p>
-            <w:r>
-              <w:rPr>
-                <w:b/>
-                <w:color w:val="A33A2C"/>
-                <w:sz w:val="19"/>
-              </w:rPr>
-              <w:t>3  Urgent</w:t>
-            </w:r>
-          </w:p>
-        </w:tc>
-        <w:tc>
-          <w:tcPr>
-            <w:tcW w:type="dxa" w:w="7200"/>
-          </w:tcPr>
-          <w:p>
-            <w:r>
-              <w:rPr>
-                <w:sz w:val="19"/>
-              </w:rPr>
-              <w:t>Immediate human and a priority alert: a mental health crisis, self harm, or a medical emergency.</w:t>
-            </w:r>
-          </w:p>
-        </w:tc>
-      </w:tr>
-    </w:tbl>
-    <w:p>
-      <w:pPr>
-        <w:spacing w:after="40" w:before="80"/>
-      </w:pPr>
-      <w:r>
-        <w:rPr>
-          <w:b/>
-          <w:i w:val="0"/>
-          <w:sz w:val="21"/>
-        </w:rPr>
-        <w:t>Questions to confirm so we can write these rules precisely:</w:t>
+        <w:t>We have the framework agreed (operational stays with the team, anything clinical goes to a clinician, urgent gets an immediate human). These are the last few points to make it watertight for the team and the assistant.</w:t>
       </w:r>
     </w:p>
     <w:p>
@@ -841,7 +732,7 @@
         <w:rPr>
           <w:sz w:val="21"/>
         </w:rPr>
-        <w:t>Two or three examples of questions that sound operational but are actually clinical, and must be passed on.</w:t>
+        <w:t>Two or three real examples of questions that sound operational but are actually clinical, so the line is unmistakable.</w:t>
       </w:r>
     </w:p>
     <w:p>
@@ -853,7 +744,7 @@
         <w:rPr>
           <w:sz w:val="21"/>
         </w:rPr>
-        <w:t>The exact holding message a patient should receive about a medication question (for example "should I change my dose", "is this side effect normal") while a clinician takes over.</w:t>
+        <w:t>The exact holding message a patient receives about a medication question (for example "should I change my dose", "is this side effect normal") while a clinician takes over.</w:t>
       </w:r>
     </w:p>
     <w:p>
@@ -865,7 +756,7 @@
         <w:rPr>
           <w:sz w:val="21"/>
         </w:rPr>
-        <w:t>Blood results: confirm these always go to the clinician and are never sent to the patient, unless the patient supplies their own.</w:t>
+        <w:t>Urgent and safeguarding: a mental health crisis, self harm or emergency. What is the patient told immediately, which words or phrases must always trigger a priority alert, and who is notified and how?</w:t>
       </w:r>
     </w:p>
     <w:p>
@@ -877,7 +768,7 @@
         <w:rPr>
           <w:sz w:val="21"/>
         </w:rPr>
-        <w:t>Prescriptions: exactly what the team should check before processing a repeat (current patient, follow up due per the treatment plan), and what happens if the patient is overdue.</w:t>
+        <w:t>For an overdue patient requesting a repeat prescription: what should the team do (for example, ask them to rebook first)?</w:t>
       </w:r>
     </w:p>
     <w:p>
@@ -889,31 +780,7 @@
         <w:rPr>
           <w:sz w:val="21"/>
         </w:rPr>
-        <w:t>The "two short emails, then it becomes a consultation" rule: confirm the trigger and the wording.</w:t>
-      </w:r>
-    </w:p>
-    <w:p>
-      <w:pPr>
-        <w:pStyle w:val="ListBullet"/>
-        <w:spacing w:after="80"/>
-      </w:pPr>
-      <w:r>
-        <w:rPr>
-          <w:sz w:val="21"/>
-        </w:rPr>
-        <w:t>Urgent messages: what the patient should be told immediately, which words or phrases must always trigger a priority alert, and who is notified and how.</w:t>
-      </w:r>
-    </w:p>
-    <w:p>
-      <w:pPr>
-        <w:pStyle w:val="ListBullet"/>
-        <w:spacing w:after="80"/>
-      </w:pPr>
-      <w:r>
-        <w:rPr>
-          <w:sz w:val="21"/>
-        </w:rPr>
-        <w:t>The short list of things the assistant must never answer, under any circumstances.</w:t>
+        <w:t>The short list of anything the assistant must never answer, under any circumstances.</w:t>
       </w:r>
     </w:p>
     <w:p>
@@ -929,7 +796,7 @@
           <w:color w:val="142A28"/>
           <w:sz w:val="28"/>
         </w:rPr>
-        <w:t>3. Doctor routing and oversight</w:t>
+        <w:t>3. Doctor routing and oversight (as the clinic grows)</w:t>
       </w:r>
     </w:p>
     <w:p>
@@ -943,7 +810,7 @@
           <w:color w:val="55605F"/>
           <w:sz w:val="21"/>
         </w:rPr>
-        <w:t>As the clinic grows and more doctors join, clinical questions should reach the right treating doctor, with clear oversight so nothing is missed.</w:t>
+        <w:t>So clinical questions reach the right treating doctor, with the oversight you asked for, so nothing is missed when a doctor is busy or away.</w:t>
       </w:r>
     </w:p>
     <w:p>
@@ -967,7 +834,7 @@
         <w:rPr>
           <w:sz w:val="21"/>
         </w:rPr>
-        <w:t>How would you like to stay aware of open queries: a short daily summary per doctor, a shared view you can check at any time, or an alert only when something has been unanswered beyond a set time?</w:t>
+        <w:t>How would you like to stay aware of open queries: a short daily summary per doctor, a shared view you can check at any time, or an alert only when something is unanswered beyond a set time?</w:t>
       </w:r>
     </w:p>
     <w:p>
@@ -1008,7 +875,7 @@
           <w:color w:val="0B534E"/>
           <w:sz w:val="22"/>
         </w:rPr>
-        <w:t>Current presence: summary</w:t>
+        <w:t>Current presence: summary (presented on the call)</w:t>
       </w:r>
     </w:p>
     <w:tbl>
@@ -1179,20 +1046,6 @@
     </w:tbl>
     <w:p>
       <w:pPr>
-        <w:spacing w:after="120" w:before="20"/>
-      </w:pPr>
-      <w:r>
-        <w:rPr>
-          <w:b w:val="0"/>
-          <w:i/>
-          <w:color w:val="8A9795"/>
-          <w:sz w:val="18"/>
-        </w:rPr>
-        <w:t>(Findings to be presented on the call.)</w:t>
-      </w:r>
-    </w:p>
-    <w:p>
-      <w:pPr>
         <w:spacing w:before="160" w:after="40"/>
       </w:pPr>
       <w:r>
@@ -1341,7 +1194,7 @@
         <w:rPr>
           <w:sz w:val="21"/>
         </w:rPr>
-        <w:t>Website analytics (Google Analytics), to see traffic and where enquiries come from.</w:t>
+        <w:t>Website analytics (Google Analytics).</w:t>
       </w:r>
     </w:p>
     <w:p>
@@ -1353,7 +1206,7 @@
         <w:rPr>
           <w:sz w:val="21"/>
         </w:rPr>
-        <w:t>Google Business Profile, for local search visibility.</w:t>
+        <w:t>Google Business Profile.</w:t>
       </w:r>
     </w:p>
     <w:p>

</xml_diff>